<commit_message>
docs: update findings, report draft, and problem template with underutilization insights
</commit_message>
<xml_diff>
--- a/docs/template_masalah_terisi.docx
+++ b/docs/template_masalah_terisi.docx
@@ -166,7 +166,7 @@
         </w:rPr>
       </w:pPr>
       <w:r>
-        <w:t>2. Mengapa tingkat pengangguran terbuka pada lulusan SMK Kejuruan (6,81%) dan Perguruan Tinggi (5,33%) secara persisten jauh melampaui lulusan SD (1,92%)—apa faktor pendorong 'Educated Unemployment Paradox' di Indonesia?</w:t>
+        <w:t>2. Mengapa tingkat pengangguran terbuka pada lulusan SMK Kejuruan (6,81%) dan Perguruan Tinggi (5,33%) secara persisten jauh melampaui lulusan SD (1,92%): apa faktor pendorong 'Educated Unemployment Paradox' di Indonesia?</w:t>
       </w:r>
     </w:p>
     <w:p>
@@ -183,7 +183,7 @@
         </w:rPr>
       </w:pPr>
       <w:r>
-        <w:t>3. Sejauh mana krisis ketenagakerjaan terkonsentrasi pada generasi muda (15–24 tahun) dan bagaimana dampaknya terhadap ancaman kegagalan pemanfaatan jendela bonus demografi menuju Indonesia Emas 2045?</w:t>
+        <w:t>3. Sejauh mana krisis ketenagakerjaan terkonsentrasi pada generasi muda (15-24 tahun) dan bagaimana dampaknya terhadap ancaman kegagalan pemanfaatan jendela bonus demografi menuju Indonesia Emas 2045?</w:t>
       </w:r>
     </w:p>
     <w:p>
@@ -200,7 +200,7 @@
         </w:rPr>
       </w:pPr>
       <w:r>
-        <w:t>4. Bagaimana tipologi klaster ketenagakerjaan daerah di Indonesia, dan instrumen kebijakan afirmatif apa yang terbukti paling berdaya guna ('Turning Insight into Opportunity') untuk mempercepat pemerataan kesempatan kerja?</w:t>
+        <w:t>4. Bagaimana fenomena gunung es setengah pengangguran (11,56 juta orang) dan dikotomi kota-desa memengaruhi perumusan instrumen kebijakan afirmatif ('Turning Insight into Opportunity') untuk mencapai target RPJMN 2029?</w:t>
       </w:r>
     </w:p>
     <w:p>
@@ -275,7 +275,7 @@
         </w:rPr>
       </w:pPr>
       <w:r>
-        <w:t>Bagian I: 'The Demographic Cliff' — Krisis Ketenagakerjaan dan Jebakan Waktu Generasi Muda</w:t>
+        <w:t>Bagian I: 'The Demographic Cliff': Krisis Ketenagakerjaan dan Jebakan Waktu Generasi Muda</w:t>
       </w:r>
     </w:p>
     <w:p>
@@ -293,7 +293,7 @@
         </w:rPr>
       </w:pPr>
       <w:r>
-        <w:t>Bagian II: 'The Diploma Paradox' — Anomali Pengangguran Terdidik &amp; Retaknya Jembatan Vokasi</w:t>
+        <w:t>Bagian II: 'The Diploma Paradox': Anomali Pengangguran Terdidik &amp; Retaknya Jembatan Vokasi</w:t>
       </w:r>
     </w:p>
     <w:p>
@@ -311,7 +311,7 @@
         </w:rPr>
       </w:pPr>
       <w:r>
-        <w:t>Bagian III: 'The Spatial Fracture' — Disparitas Regional dan Ilusi Pengangguran Rendah</w:t>
+        <w:t>Bagian III: 'The Spatial Fracture': Disparitas Regional dan Ilusi Pengangguran Rendah</w:t>
       </w:r>
     </w:p>
     <w:p>
@@ -329,7 +329,7 @@
         </w:rPr>
       </w:pPr>
       <w:r>
-        <w:t>Bagian IV: 'The Recovery Drift' — Jejak Luka Pandemi dan Evaluasi Daya Pulih Lapangan Kerja</w:t>
+        <w:t>Bagian IV: 'The Underutilization Iceberg': Lonjakan Setengah Penganggur &amp; Dikotomi Kota-Desa</w:t>
       </w:r>
     </w:p>
     <w:p>
@@ -347,7 +347,7 @@
         </w:rPr>
       </w:pPr>
       <w:r>
-        <w:t>Bagian V: 'Turning Insight into Opportunity' — Matriks Intervensi Kebijakan Berbasis Klaster Wilayah</w:t>
+        <w:t>Bagian V: 'Turning Insight into Opportunity': Matriks Target 5,4 Juta Peluang Kerja Berbasis Klaster</w:t>
       </w:r>
     </w:p>
     <w:p>
@@ -409,7 +409,7 @@
           <w:sz w:val="26"/>
         </w:rPr>
         <w:br/>
-        <w:t>Bagian I: “The Demographic Cliff” — Krisis Ketenagakerjaan dan Jebakan Waktu Generasi Muda</w:t>
+        <w:t>Bagian I: “The Demographic Cliff”: Krisis Ketenagakerjaan dan Jebakan Waktu Generasi Muda</w:t>
       </w:r>
     </w:p>
     <w:p>
@@ -431,7 +431,7 @@
         <w:t xml:space="preserve">Data Resmi BPS: </w:t>
       </w:r>
       <w:r>
-        <w:t>• TPT Usia Muda (15–24 tahun) per Agustus 2024 mencapai 17,02%, sedangkan TPT Usia Dewasa (25–59 tahun) hanya 2,45%.</w:t>
+        <w:t>• TPT Usia Muda (15-24 tahun) per Agustus 2024 mencapai 17,02%, sedangkan TPT Usia Dewasa (25-59 tahun) hanya 2,45%.</w:t>
         <w:br/>
         <w:t>• Rasio pengangguran muda terhadap dewasa adalah 6,95 kali lipat.</w:t>
         <w:br/>
@@ -476,7 +476,7 @@
           <w:sz w:val="26"/>
         </w:rPr>
         <w:br/>
-        <w:t>Bagian II: “The Diploma Paradox” — Anomali Pengangguran Terdidik &amp; Retaknya Jembatan Vokasi</w:t>
+        <w:t>Bagian II: “The Diploma Paradox”: Anomali Pengangguran Terdidik &amp; Retaknya Jembatan Vokasi</w:t>
       </w:r>
     </w:p>
     <w:p>
@@ -511,6 +511,8 @@
         <w:t>• TPT SD ke Bawah: 1,92% (Terendah).</w:t>
         <w:br/>
         <w:t>• Lulusan pendidikan menengah (SMA &amp; SMK) menyumbang 55,37% dari total penganggur di Indonesia.</w:t>
+        <w:br/>
+        <w:t>• Stagnasi Sektor Manufaktur: Penyerapan tenaga kerja sektor pabrik pengolahan formal stagnan di 13,83% (2023 vs 2024).</w:t>
       </w:r>
     </w:p>
     <w:p>
@@ -547,7 +549,7 @@
           <w:sz w:val="26"/>
         </w:rPr>
         <w:br/>
-        <w:t>Bagian III: “The Spatial Fracture” — Disparitas Regional dan Ilusi Pengangguran Rendah</w:t>
+        <w:t>Bagian III: “The Spatial Fracture”: Disparitas Regional dan Ilusi Pengangguran Rendah</w:t>
       </w:r>
     </w:p>
     <w:p>
@@ -612,7 +614,7 @@
           <w:sz w:val="26"/>
         </w:rPr>
         <w:br/>
-        <w:t>Bagian IV: “The Recovery Drift” — Jejak Luka Pandemi dan Evaluasi Daya Pulih Lapangan Kerja</w:t>
+        <w:t>Bagian IV: “The Underutilization Iceberg”: Lonjakan Setengah Penganggur &amp; Dikotomi Kota-Desa</w:t>
       </w:r>
     </w:p>
     <w:p>
@@ -623,7 +625,7 @@
         <w:t xml:space="preserve">Prelude: </w:t>
       </w:r>
       <w:r>
-        <w:t>Dinamika 8 tahun terakhir (2017–2024) mencatat guncangan struktural terbesar dalam sejarah ketenagakerjaan modern: pandemi COVID-19 pada 2020 yang melambungkan TPT nasional ke angka 7,07%. Meski pada Agustus 2024 angka TPT nasional telah pulih ke 4,91% (di bawah pra-pandemi 2019), trajektori pemulihan di tingkat daerah berlangsung dengan dua kecepatan yang sangat berbeda. Beberapa provinsi manufaktur pulih pesat, sementara daerah lain mengalami efek luka persisten (hysteresis) di mana lapangan kerja formal berkualitas belum sepenuhnya kembali.</w:t>
+        <w:t>Penurunan TPT nasional ke 4,91% menutupi kenyataan bahwa kualitas pekerjaan di Indonesia justru mengalami kemunduran. Standar ILO membuktikan bahwa pengangguran terbuka hanyalah puncak gunung es: jumlah setengah penganggur (pekerja jam rendah yang butuh kerja tambahan) justru meledak +23,8% dalam setahun. Terjadi keterbelahan dua wajah ketenagakerjaan: antrean kerja formal di perkotaan vs perangkap setengah penganggur paruh waktu di perdesaan.</w:t>
       </w:r>
     </w:p>
     <w:p>
@@ -634,13 +636,19 @@
         <w:t xml:space="preserve">Data Resmi BPS: </w:t>
       </w:r>
       <w:r>
-        <w:t>• Trajektori TPT Nasional: 2017 (5,50%) -&gt; 2018 (5,30%) -&gt; 2019 (5,23%) -&gt; 2020 Lonjakan Pandemi (7,07%) -&gt; 2021 (6,49%) -&gt; 2022 (5,86%) -&gt; 2023 (5,32%) -&gt; 2024 (4,91%).</w:t>
-        <w:br/>
-        <w:t>• Besaran Guncangan: +1,84 persen poin pada tahun 2020 (+2,67 juta penganggur baru akibat pembatasan mobilitas).</w:t>
-        <w:br/>
-        <w:t>• Provinsi Pemulihan Terpesat (2019 vs 2024): Riau (-2,06 poin), Banten (-1,43 poin), Jawa Barat (-1,29 poin), Kepulauan Riau (-1,11 poin).</w:t>
-        <w:br/>
-        <w:t>• Provinsi yang Mengalami Pemulihan Lambat / Kenaikan TPT: Papua (+2,97 poin), Jawa Timur (+0,37 poin), DI Yogyakarta (+0,30 poin).</w:t>
+        <w:t>• Lonjakan Setengah Penganggur: Naik dari 9,34 juta (6,68%) di 2023 menjadi 11,56 juta orang (7,99%) di 2024 (+2,22 juta orang / +23,8%).</w:t>
+        <w:br/>
+        <w:t>• Defisit Utilisasi Kerja Nasional (Standar ILO LU2): 12,51% atau 19,03 juta orang angkatan kerja mengalami kekurangan jam kerja dan pengangguran.</w:t>
+        <w:br/>
+        <w:t>• Dikotomi Kota vs Desa (Agustus 2024):</w:t>
+        <w:br/>
+        <w:t xml:space="preserve">  - TPT Total: Perkotaan 5,79% vs Perdesaan 3,67% (Kota 1,58x lebih tinggi).</w:t>
+        <w:br/>
+        <w:t xml:space="preserve">  - Setengah Penganggur: Perkotaan 6,09% vs Perdesaan 10,60% (Desa 1,74x lebih parah).</w:t>
+        <w:br/>
+        <w:t xml:space="preserve">  - TPT Usia Muda: Perkotaan 19,86% (1 dari 5 pemuda kota menganggur) vs Perdesaan 13,85%.</w:t>
+        <w:br/>
+        <w:t xml:space="preserve">  - Rasio Kerentanan Pemuda vs Dewasa: Perdesaan 7,45x lipat vs Perkotaan 5,93x lipat.</w:t>
       </w:r>
     </w:p>
     <w:p>
@@ -651,7 +659,7 @@
         <w:t xml:space="preserve">Link Sumber: </w:t>
       </w:r>
       <w:r>
-        <w:t>https://web-api.bps.go.id/download.php?f=BGTg1p02Du9WXu5Fccj77mxaZDlYODZwWlpxV0p4TUNrMjZucWQ1L3NSc01KNFU0T0tjU3pWTFFGQStIVHNsd3BnYlUwUVpjTWdXN3d5ekxaL1hDK2VsY3NsOUFWRTJSemFQZk0xbEFEQWFMS3F1TXBQWk5UNit4aFkyUXU2c0ErZHNpR1JVN2p6RHNUeDhuVkh1N0NNaktYNFpma0NEckRGTFBaNkhKTGJOeXlXbHJ1R3dwMUZ1TklrQ0NXR3U1RCtLN3dIZGxzUFBpcHp1bnpoWk41Z3JDcHdtUXhvYkhTVHBVYVhVYS9VN0pMNXNMSWV1QTFXc2kvVXBQVVFoZ3lzVlVWQ09KNCtNZ1Fmc3Y1cUpaQVlIMTdrVFBsU242TFdyaVJiY1NoZDJOV0pXWHZGRGN3dnJUTzQrOGFHK1BjZHZBdW5QRWppOHVaMy9M (Tabel 5.6 &amp; Profil Pengangguran BPS)</w:t>
+        <w:t>https://www.bps.go.id/id/publication/2024/12/16/d96c70fc6be192f04edf7fe0 (Lampiran 13: Pekerja Paruh Waktu, Lampiran 15: Jam Kerja, &amp; KILM 12: Setengah Pengangguran)</w:t>
       </w:r>
     </w:p>
     <w:p>
@@ -662,9 +670,9 @@
         <w:t xml:space="preserve">Rekomendasi Visualisasi: </w:t>
       </w:r>
       <w:r>
-        <w:t>• Visualisasi Utama: Area Timeline Chart (2017–2024) yang menonjolkan puncak patahan struktural 2020 dengan shading 'Guncangan Pandemi' dan garis tren proyeksi melandai ke 4,91% di 2024.</w:t>
-        <w:br/>
-        <w:t>• Mini-Sparklines: Perbandingan trajektori pemulihan provinsi kontras (Jabar &amp; Riau pulih tajam vs Jatim &amp; Papua melambat).</w:t>
+        <w:t>• Visualisasi Utama: Stacked Waterfall / Iceberg Chart (Chart 14) membandingkan TPT 4,91% (7,47 jt) vs Setengah Penganggur 7,99% (11,56 jt) vs LU2 12,51% (19,03 jt).</w:t>
+        <w:br/>
+        <w:t>• Visual Komparasi: Bilateral Dumbbell Plot (Chart 15) yang mengontraskan 5 indikator pasar kerja Perkotaan vs Perdesaan.</w:t>
       </w:r>
     </w:p>
     <w:p>
@@ -675,7 +683,7 @@
           <w:sz w:val="26"/>
         </w:rPr>
         <w:br/>
-        <w:t>Bagian V: “Turning Insight into Opportunity” — Matriks Intervensi Kebijakan Berbasis Klaster Wilayah</w:t>
+        <w:t>Bagian V: “Turning Insight into Opportunity”: Matriks Target 5,4 Juta Peluang Kerja Berbasis Klaster</w:t>
       </w:r>
     </w:p>
     <w:p>
@@ -686,7 +694,7 @@
         <w:t xml:space="preserve">Prelude: </w:t>
       </w:r>
       <w:r>
-        <w:t>Kebijakan ketenagakerjaan 'satu ukuran untuk semua' (one-size-fits-all) telah terbukti usang. Berdasarkan hasil analisis data BPS, Indonesia terbagi ke dalam 3 tipologi pasar kerja yang memiliki akar permasalahan berbeda secara fundamental. Untuk mewujudkan pemerataan kesempatan kerja yang nyata, solusi kebijakan harus ditargetkan secara presisi sesuai klaster wilayah: menghubungkan lulusan vokasi dengan industri berteknologi di kawasan urban, melakukan transformasi formalitas di kawasan agraris, dan mempercepat ekonomi digital di kawasan transisi.</w:t>
+        <w:t>Kebijakan ketenagakerjaan 'satu ukuran untuk semua' (one-size-fits-all) telah terbukti usang. Untuk mencapai target RPJMN 2025-2029 (TPT nasional 4,00% - 4,50%), Indonesia membutuhkan penciptaan 5,40 juta kesempatan kerja berkualitas yang dialokasikan secara presisi ke dalam 3 klaster pasar kerja daerah: mengatasi kemacetan vokasi industri di kawasan perkotaan, mengonversi setengah penganggur agraris menjadi pekerja penuh waktu, dan mempercepat ekonomi digital di kawasan transisi.</w:t>
       </w:r>
     </w:p>
     <w:p>
@@ -697,28 +705,34 @@
         <w:t xml:space="preserve">Data Resmi BPS: </w:t>
       </w:r>
       <w:r>
-        <w:t>Hasil Klasterisasi K-Means (k = 3, Evaluasi Silhouette = 0,441):</w:t>
-        <w:br/>
-        <w:br/>
-        <w:t>1. KLASTER 1: URBAN-INDUSTRIAL TRAP (8 Provinsi — DKI, Jabar, Banten, Kepri, Kaltim, Papua, Papua Barat Daya, Maluku)</w:t>
-        <w:br/>
-        <w:t xml:space="preserve">   • Karakteristik: TPT Tinggi (rata-rata 6,58%), Formal Tinggi (56,8%), Upah Tinggi (Rp3,85 jt), Mismatch Vokasi Akut.</w:t>
-        <w:br/>
-        <w:t xml:space="preserve">   • Solusi Konkret: 'Vocational Dual-System &amp; Tax Superdeduction' — Kurikulum co-creation industri manufaktur/IT, insentif pajak penyerapan pemuda lokal, dan standardisasi upah magang bersertifikat.</w:t>
-        <w:br/>
-        <w:br/>
-        <w:t>2. KLASTER 2: AGRARIS-INFORMAL SHELTER (18 Provinsi — NTT, NTB, Sulbar, Sulteng, Gorontalo, Lampung, Bengkulu, Papua Pegunungan, Papua Tengah, Papua Selatan, dll.)</w:t>
-        <w:br/>
-        <w:t xml:space="preserve">   • Karakteristik: TPT Rendah Semu (2,82%), Informalitas Ekstrem (75,4%), Upah Rendah (Rp2,62 jt), Setengah Penganggur Tinggi.</w:t>
-        <w:br/>
-        <w:t xml:space="preserve">   • Solusi Konkret: 'Agro-Downstreaming &amp; Formalization Safety Net' — Hilirisasi komoditas pertanian/perikanan lokal skala UMKM, subsidi iuran jaminan sosial BPJS Ketenagakerjaan bagi pekerja rentan, dan digitalisasi rantai pasok daerah.</w:t>
-        <w:br/>
-        <w:br/>
-        <w:t>3. KLASTER 3: TRANSISI BERIMBANG (12 Provinsi — Jateng, Jatim, DIY, Bali, Sumut, Sumbar, Sumsel, Jambi, Riau, Kalbar, Kalteng, Kalsel)</w:t>
-        <w:br/>
-        <w:t xml:space="preserve">   • Karakteristik: TPT Moderat (4,52%), Pasar Kerja Terdiversifikasi, Informalitas 52,6%, Upah Rp2,88 jt.</w:t>
-        <w:br/>
-        <w:t xml:space="preserve">   • Solusi Konkret: 'Youth Creative-Tech Hub &amp; Micro-Capital' — Inkubasi wirausaha digital pemuda, fasilitasi akses modal kerja berbunga rendah (KUR Klaster), dan sertifikasi talenta gig-economy.</w:t>
+        <w:t>Target Penciptaan 5,40 Juta Kesempatan Kerja Berkualitas Menuju 2029:</w:t>
+        <w:br/>
+        <w:br/>
+        <w:t>1. KLASTER 1: URBAN-INDUSTRIAL TRAP (8 Provinsi: DKI, Jabar, Banten, Kepri, Kaltim, Papua, Papua Barat Daya, Maluku)</w:t>
+        <w:br/>
+        <w:t xml:space="preserve">   • Target: TPT turun dari 6,58% menjadi &lt; 5,20%.</w:t>
+        <w:br/>
+        <w:t xml:space="preserve">   • Alokasi: 1,85 Juta Lowongan Kerja Formal Industri Manufaktur &amp; Jasa IT.</w:t>
+        <w:br/>
+        <w:t xml:space="preserve">   • Solusi: Vocational Dual-System, insentif Tax Superdeduction penyerapan pemuda, dan standarisasi upah magang formal.</w:t>
+        <w:br/>
+        <w:br/>
+        <w:t>2. KLASTER 2: AGRARIS-INFORMAL SHELTER (18 Provinsi: NTT, NTB, Sulbar, Sulteng, Gorontalo, Lampung, Bengkulu, Papua Pegunungan, Papua Tengah, Papua Selatan, dll.)</w:t>
+        <w:br/>
+        <w:t xml:space="preserve">   • Target: Tingkat Setengah Pengangguran turun dari 11,2% menjadi &lt; 7,0%.</w:t>
+        <w:br/>
+        <w:t xml:space="preserve">   • Alokasi: 2,10 Juta Peningkatan Jam Kerja Penuh melalui Hilirisasi Komoditas Pertanian.</w:t>
+        <w:br/>
+        <w:t xml:space="preserve">   • Solusi: Korporatisasi petani lokal, modernisasi alat pascapanen, dan subsidi iuran BPJS Ketenagakerjaan bagi pekerja rentan.</w:t>
+        <w:br/>
+        <w:br/>
+        <w:t>3. KLASTER 3: TRANSISI BERIMBANG (12 Provinsi: Jateng, Jatim, DIY, Bali, Sumut, Sumbar, Sumsel, Jambi, Riau, Kalbar, Kalteng, Kalsel)</w:t>
+        <w:br/>
+        <w:t xml:space="preserve">   • Target: TPT turun dari 4,52% menjadi &lt; 3,80%.</w:t>
+        <w:br/>
+        <w:t xml:space="preserve">   • Alokasi: 1,45 Juta Pekerjaan Bernilai Tambah di Sektor Jasa Kreatif &amp; Digital.</w:t>
+        <w:br/>
+        <w:t xml:space="preserve">   • Solusi: Youth Creative-Tech Hub di kota sekunder, inkubasi wirausaha muda, dan pembiayaan KUR Klaster Berbunga Rendah.</w:t>
       </w:r>
     </w:p>
     <w:p>
@@ -729,7 +743,7 @@
         <w:t xml:space="preserve">Link Sumber: </w:t>
       </w:r>
       <w:r>
-        <w:t>https://data.go.id/ &amp; https://bps.go.id/ (Dataset Olahan Klaster Provinsi ACTION 2026)</w:t>
+        <w:t>https://data.go.id/ &amp; https://bps.go.id/ (Dataset Olahan Klaster &amp; Simulasi Target RPJMN ACTION 2026)</w:t>
       </w:r>
     </w:p>
     <w:p>
@@ -740,9 +754,9 @@
         <w:t xml:space="preserve">Rekomendasi Visualisasi: </w:t>
       </w:r>
       <w:r>
-        <w:t>• Visualisasi Utama: 3-Pillar Solution Architecture Matrix (Tiga kolom/kartu kebijakan berdampingan sesuai nama klaster, memuat ikon strategi, target provinsi, dan indikator dampak keberhasilan).</w:t>
-        <w:br/>
-        <w:t>• Penutup Callout: Rekomendasi Roadmap Aksi Nasional Menuju Pemerataan Kesempatan Kerja 2029.</w:t>
+        <w:t>• Visualisasi Utama: 3-Pillar Solution Architecture Matrix (Tiga kolom/kartu kebijakan berdampingan sesuai nama klaster, memuat target penurunan TPT, kuota lapangan kerja baru, dan strategi aksi konkret).</w:t>
+        <w:br/>
+        <w:t>• Penutup Callout: Rekomendasi Roadmap Aksi Nasional Menuju Target RPJMN 2029 (5,40 Juta Kesempatan Kerja Berkualitas).</w:t>
       </w:r>
     </w:p>
     <w:p>
@@ -833,7 +847,7 @@
           </w:tcPr>
           <w:p>
             <w:r>
-              <w:t>Mengangkat sudut pandang unik 'Educated Unemployment Paradox' dan membongkar mitos 'TPT Rendah = Makmur' melalui korelasi informalitas (r = -0,782). Bebas AI generatif.</w:t>
+              <w:t>Mengangkat sudut pandang unik 'Educated Unemployment Paradox', 'The Underutilization Iceberg' (+23,8% setengah penganggur), dan membongkar mitos 'TPT Rendah = Makmur' melalui korelasi informalitas (r = -0,782). Bebas AI generatif.</w:t>
             </w:r>
           </w:p>
         </w:tc>
@@ -865,7 +879,7 @@
           </w:tcPr>
           <w:p>
             <w:r>
-              <w:t>Hierarki visual A3 Portrait mengalir dari Hook Generasi Muda -&gt; Paradoks Pendidikan -&gt; Peta Disparitas -&gt; Tren Waktu -&gt; Matriks Solusi 3 Klaster. Pilihan warna terukur, tipografi terbaca.</w:t>
+              <w:t>Hierarki visual A3 Portrait mengalir dari Hook Generasi Muda -&gt; Paradoks Pendidikan -&gt; Peta Disparitas -&gt; Gunung Es Utilisasi Kerja -&gt; Matriks Target 5,4 Juta Peluang Kerja. Pilihan warna terukur, tipografi terbaca.</w:t>
             </w:r>
           </w:p>
         </w:tc>
@@ -897,7 +911,7 @@
           </w:tcPr>
           <w:p>
             <w:r>
-              <w:t>100% data resmi Sakernas BPS 2017–2024 dan publikasi resmi panitia. Perhitungan statistik panel, dekomposisi disparitas, dan K-Means teruji.</w:t>
+              <w:t>100% data resmi Sakernas BPS 2017-2024 dan publikasi resmi panitia. Standar ILO LU2, ekonometrika spasial SDM, dekomposisi disparitas, dan K-Means teruji.</w:t>
             </w:r>
           </w:p>
         </w:tc>

</xml_diff>